<commit_message>
docs(tr): TR atualizado com os requisitos que passaram a valer apos as correcoes
148 requisitos na versao completa (eram 127) e 119 na enxuta (eram 98):
perfis de acesso, sigilo, segregacao por UG, versionamento, auditoria e
historico consultaveis, lixeira, assinatura em ordem, recusa, conferencia
do certificado no ato, acoes de processo conferidas no servidor, anexos,
comentarios, notificacoes, recuperacao de senha e verificacao por QR.
Roteiro da prova de conceito ganha controle de acesso, sigilo e versoes.
README lista o que foi corrigido e o que segue pendente.

Co-Authored-By: Claude Opus 5.5 <noreply@anthropic.com>
</commit_message>
<xml_diff>
--- a/docs/propostas/tr-referencia/docx/TR-completo.docx
+++ b/docs/propostas/tr-referencia/docx/TR-completo.docx
@@ -938,7 +938,7 @@
         <w:t xml:space="preserve">múltiplas unidades gestoras</w:t>
       </w:r>
       <w:r>
-        <w:t xml:space="preserve"> no mesmo ente, com seleção obrigatória da unidade de trabalho após a autenticação, seleção automática quando o usuário possuir vínculo com uma única unidade, troca de unidade sem nova autenticação e revalidação do vínculo a cada operação.</w:t>
+        <w:t xml:space="preserve"> no mesmo ente, com seleção obrigatória da unidade de trabalho após a autenticação, seleção automática quando o usuário possuir vínculo com uma única unidade, troca de unidade sem nova autenticação, revalidação do vínculo a cada operação e restrição de todas as consultas, pesquisas, painéis e cadastros à unidade gestora ativa.</w:t>
       </w:r>
     </w:p>
     <w:p>
@@ -1370,6 +1370,80 @@
     </w:p>
     <w:p>
       <w:pPr>
+        <w:spacing w:after="120" w:line="276"/>
+        <w:jc w:val="both"/>
+      </w:pPr>
+      <w:r>
+        <w:rPr>
+          <w:b/>
+          <w:bCs/>
+        </w:rPr>
+        <w:t xml:space="preserve">RS-008.</w:t>
+      </w:r>
+      <w:r>
+        <w:t xml:space="preserve"> </w:t>
+      </w:r>
+      <w:r>
+        <w:rPr>
+          <w:b/>
+          <w:bCs/>
+        </w:rPr>
+        <w:t xml:space="preserve">Perfis de acesso</w:t>
+      </w:r>
+      <w:r>
+        <w:t xml:space="preserve"> configuráveis pela Administração, compostos de permissões por módulo e ação — consultar, incluir, editar, excluir e administrar —, atribuíveis a um ou mais perfis por usuário, com verificação da permissão no servidor a cada operação e ocultação, nos menus e na busca de funcionalidades, das rotinas não permitidas.</w:t>
+      </w:r>
+    </w:p>
+    <w:p>
+      <w:pPr>
+        <w:spacing w:after="120" w:line="276"/>
+        <w:jc w:val="both"/>
+      </w:pPr>
+      <w:r>
+        <w:rPr>
+          <w:b/>
+          <w:bCs/>
+        </w:rPr>
+        <w:t xml:space="preserve">RS-009.</w:t>
+      </w:r>
+      <w:r>
+        <w:t xml:space="preserve"> Concessão e retirada do privilégio de administrador geral exclusivamente por quem já o detenha, vedada a alteração ou a exclusão de conta de administrador geral por usuário sem esse privilégio.</w:t>
+      </w:r>
+    </w:p>
+    <w:p>
+      <w:pPr>
+        <w:spacing w:after="120" w:line="276"/>
+        <w:jc w:val="both"/>
+      </w:pPr>
+      <w:r>
+        <w:rPr>
+          <w:b/>
+          <w:bCs/>
+        </w:rPr>
+        <w:t xml:space="preserve">RS-010.</w:t>
+      </w:r>
+      <w:r>
+        <w:t xml:space="preserve"> Recuperação de senha pelo próprio usuário, por link de uso único e validade limitada enviado ao correio eletrônico cadastrado, com resposta idêntica para endereço cadastrado ou não.</w:t>
+      </w:r>
+    </w:p>
+    <w:p>
+      <w:pPr>
+        <w:spacing w:after="120" w:line="276"/>
+        <w:jc w:val="both"/>
+      </w:pPr>
+      <w:r>
+        <w:rPr>
+          <w:b/>
+          <w:bCs/>
+        </w:rPr>
+        <w:t xml:space="preserve">RS-011.</w:t>
+      </w:r>
+      <w:r>
+        <w:t xml:space="preserve"> Limitação do número de tentativas de autenticação e de pedidos de recuperação de senha por período, com bloqueio temporário ao exceder o limite.</w:t>
+      </w:r>
+    </w:p>
+    <w:p>
+      <w:pPr>
         <w:pStyle w:val="Heading2"/>
         <w:keepNext/>
         <w:spacing w:after="120" w:before="240"/>
@@ -1388,7 +1462,7 @@
           <w:b/>
           <w:bCs/>
         </w:rPr>
-        <w:t xml:space="preserve">RS-008.</w:t>
+        <w:t xml:space="preserve">RS-012.</w:t>
       </w:r>
       <w:r>
         <w:t xml:space="preserve"> Credencial de cada sistema integrado exibida uma única vez, no ato da emissão, e armazenada apenas sob a forma de resumo criptográfico irreversível.</w:t>
@@ -1404,7 +1478,7 @@
           <w:b/>
           <w:bCs/>
         </w:rPr>
-        <w:t xml:space="preserve">RS-009.</w:t>
+        <w:t xml:space="preserve">RS-013.</w:t>
       </w:r>
       <w:r>
         <w:t xml:space="preserve"> Isolamento por sistema de origem: cada sistema integrado consulta, altera, cancela e recupera exclusivamente os documentos que ele próprio enviou.</w:t>
@@ -1420,10 +1494,52 @@
           <w:b/>
           <w:bCs/>
         </w:rPr>
-        <w:t xml:space="preserve">RS-010.</w:t>
+        <w:t xml:space="preserve">RS-014.</w:t>
       </w:r>
       <w:r>
         <w:t xml:space="preserve"> Na assinatura com certificado digital do tipo A1, manutenção da chave privada e da senha do certificado apenas em memória durante a operação, vedada a sua gravação em qualquer meio.</w:t>
+      </w:r>
+    </w:p>
+    <w:p>
+      <w:pPr>
+        <w:pStyle w:val="Heading2"/>
+        <w:keepNext/>
+        <w:spacing w:after="120" w:before="240"/>
+      </w:pPr>
+      <w:r>
+        <w:t xml:space="preserve">5.3. Auditoria</w:t>
+      </w:r>
+    </w:p>
+    <w:p>
+      <w:pPr>
+        <w:spacing w:after="120" w:line="276"/>
+        <w:jc w:val="both"/>
+      </w:pPr>
+      <w:r>
+        <w:rPr>
+          <w:b/>
+          <w:bCs/>
+        </w:rPr>
+        <w:t xml:space="preserve">RS-015.</w:t>
+      </w:r>
+      <w:r>
+        <w:t xml:space="preserve"> Trilha de auditoria por documento, consultável na própria ficha, com registro de criação, incorporação, visualização, download, edição — com o valor anterior e o novo de cada campo alterado —, mudança de pasta, alteração de situação, nova versão, exclusão, restauração, solicitação, assinatura e recusa de assinatura, indicando usuário, data e hora e endereço IP.</w:t>
+      </w:r>
+    </w:p>
+    <w:p>
+      <w:pPr>
+        <w:spacing w:after="120" w:line="276"/>
+        <w:jc w:val="both"/>
+      </w:pPr>
+      <w:r>
+        <w:rPr>
+          <w:b/>
+          <w:bCs/>
+        </w:rPr>
+        <w:t xml:space="preserve">RS-016.</w:t>
+      </w:r>
+      <w:r>
+        <w:t xml:space="preserve"> Histórico do processo administrativo, consultável no próprio processo, com registro de abertura, recebimento, despacho, devolução, comentário, juntada, decisão, assinatura, cancelamento e arquivamento, indicando usuário, data e hora e endereço IP.</w:t>
       </w:r>
     </w:p>
     <w:p>
@@ -1530,7 +1646,7 @@
         <w:t xml:space="preserve">RF-003.</w:t>
       </w:r>
       <w:r>
-        <w:t xml:space="preserve"> Inativação de pasta, com propagação da inativação às subpastas e preservação dos documentos nelas contidos.</w:t>
+        <w:t xml:space="preserve"> Inativação de pasta, com propagação da inativação às subpastas e preservação dos documentos nelas contidos, e reativação que restabelece a pasta e as subpastas inativadas com ela.</w:t>
       </w:r>
     </w:p>
     <w:p>
@@ -1672,7 +1788,49 @@
         <w:t xml:space="preserve">esquema próprio de metadados</w:t>
       </w:r>
       <w:r>
-        <w:t xml:space="preserve">, com campos de texto, número, data e lista de opções, rótulo e ordem de apresentação, exibido como formulário dinâmico no momento da incorporação do documento.</w:t>
+        <w:t xml:space="preserve">, com campos de texto, número, data e lista de opções, rótulo, ordem de apresentação e indicação de obrigatoriedade, exibido como formulário dinâmico no momento da incorporação do documento, com recusa da incorporação quando faltar campo obrigatório ou o valor não corresponder ao tipo do campo ou às opções da lista.</w:t>
+      </w:r>
+    </w:p>
+    <w:p>
+      <w:pPr>
+        <w:spacing w:after="120" w:line="276"/>
+        <w:jc w:val="both"/>
+      </w:pPr>
+      <w:r>
+        <w:rPr>
+          <w:b/>
+          <w:bCs/>
+        </w:rPr>
+        <w:t xml:space="preserve">RF-022.</w:t>
+      </w:r>
+      <w:r>
+        <w:t xml:space="preserve"> Consulta, na ficha do documento, dos metadados de sistema — tipo documental, autor, datas, tamanho e formato — e dos metadados específicos do tipo documental.</w:t>
+      </w:r>
+    </w:p>
+    <w:p>
+      <w:pPr>
+        <w:spacing w:after="120" w:line="276"/>
+        <w:jc w:val="both"/>
+      </w:pPr>
+      <w:r>
+        <w:rPr>
+          <w:b/>
+          <w:bCs/>
+        </w:rPr>
+        <w:t xml:space="preserve">RF-023.</w:t>
+      </w:r>
+      <w:r>
+        <w:t xml:space="preserve"> Atribuição de </w:t>
+      </w:r>
+      <w:r>
+        <w:rPr>
+          <w:b/>
+          <w:bCs/>
+        </w:rPr>
+        <w:t xml:space="preserve">grau de sigilo</w:t>
+      </w:r>
+      <w:r>
+        <w:t xml:space="preserve"> ao documento — público, interno, confidencial ou restrito —, com restrição efetiva do acesso: o documento confidencial é acessível somente ao autor, aos signatários e aos usuários com permissão específica; o restrito, somente ao autor e aos signatários. O documento sem acesso não aparece em listagens, pesquisas nem painéis.</w:t>
       </w:r>
     </w:p>
     <w:p>
@@ -1729,6 +1887,32 @@
     </w:p>
     <w:p>
       <w:pPr>
+        <w:spacing w:after="120" w:line="276"/>
+        <w:jc w:val="both"/>
+      </w:pPr>
+      <w:r>
+        <w:rPr>
+          <w:b/>
+          <w:bCs/>
+        </w:rPr>
+        <w:t xml:space="preserve">RF-032.</w:t>
+      </w:r>
+      <w:r>
+        <w:t xml:space="preserve"> </w:t>
+      </w:r>
+      <w:r>
+        <w:rPr>
+          <w:b/>
+          <w:bCs/>
+        </w:rPr>
+        <w:t xml:space="preserve">Versionamento</w:t>
+      </w:r>
+      <w:r>
+        <w:t xml:space="preserve"> de documentos, com envio de nova versão pela interface, preservação integral das versões anteriores, consulta do número, do autor, da data, do comentário e do resumo criptográfico de cada versão, download de qualquer versão e restauração de versão anterior como nova versão, sem alteração do histórico. Envio de nova versão bloqueado durante coleta de assinaturas.</w:t>
+      </w:r>
+    </w:p>
+    <w:p>
+      <w:pPr>
         <w:pStyle w:val="Heading2"/>
         <w:keepNext/>
         <w:spacing w:after="120" w:before="240"/>
@@ -1855,6 +2039,22 @@
     </w:p>
     <w:p>
       <w:pPr>
+        <w:spacing w:after="120" w:line="276"/>
+        <w:jc w:val="both"/>
+      </w:pPr>
+      <w:r>
+        <w:rPr>
+          <w:b/>
+          <w:bCs/>
+        </w:rPr>
+        <w:t xml:space="preserve">RF-053.</w:t>
+      </w:r>
+      <w:r>
+        <w:t xml:space="preserve"> Listas de documentos acessados recentemente pelo usuário e de documentos mais acessados na unidade gestora.</w:t>
+      </w:r>
+    </w:p>
+    <w:p>
+      <w:pPr>
         <w:pStyle w:val="Heading2"/>
         <w:keepNext/>
         <w:spacing w:after="120" w:before="240"/>
@@ -1892,7 +2092,17 @@
         <w:t xml:space="preserve">RF-061.</w:t>
       </w:r>
       <w:r>
-        <w:t xml:space="preserve"> Exclusão lógica de documentos, individualmente ou em lote, com preservação do arquivo digital e do registro na base de dados.</w:t>
+        <w:t xml:space="preserve"> Exclusão lógica de documentos, individualmente ou em lote, com preservação do arquivo digital e do registro na base de dados, e </w:t>
+      </w:r>
+      <w:r>
+        <w:rPr>
+          <w:b/>
+          <w:bCs/>
+        </w:rPr>
+        <w:t xml:space="preserve">lixeira</w:t>
+      </w:r>
+      <w:r>
+        <w:t xml:space="preserve"> com a relação dos documentos excluídos, de quem os excluiu e de quando, e restauração do documento à pasta de origem, registrada em auditoria.</w:t>
       </w:r>
     </w:p>
     <w:p>
@@ -1964,7 +2174,7 @@
         <w:t xml:space="preserve">qualificada</w:t>
       </w:r>
       <w:r>
-        <w:t xml:space="preserve">, na forma do art. 4º, inciso III, da Lei nº 14.063/2020, com certificado digital ICP-Brasil do tipo A1, observado o requisito RS-010.</w:t>
+        <w:t xml:space="preserve">, na forma do art. 4º, inciso III, da Lei nº 14.063/2020, com certificado digital ICP-Brasil do tipo A1, observado o requisito RS-014.</w:t>
       </w:r>
     </w:p>
     <w:p>
@@ -1980,7 +2190,7 @@
         <w:t xml:space="preserve">RF-102.</w:t>
       </w:r>
       <w:r>
-        <w:t xml:space="preserve"> Conferência, no ato da assinatura qualificada, da correspondência entre o CPF do titular do certificado e o CPF cadastrado do usuário signatário.</w:t>
+        <w:t xml:space="preserve"> Conferência, no ato da assinatura qualificada, de que o certificado está dentro do prazo de validade e não foi inativado pelo titular, e de que o CPF do titular do certificado corresponde ao CPF cadastrado do usuário signatário, recusada a assinatura de usuário sem CPF cadastrado.</w:t>
       </w:r>
     </w:p>
     <w:p>
@@ -2037,6 +2247,22 @@
     </w:p>
     <w:p>
       <w:pPr>
+        <w:spacing w:after="120" w:line="276"/>
+        <w:jc w:val="both"/>
+      </w:pPr>
+      <w:r>
+        <w:rPr>
+          <w:b/>
+          <w:bCs/>
+        </w:rPr>
+        <w:t xml:space="preserve">RF-107.</w:t>
+      </w:r>
+      <w:r>
+        <w:t xml:space="preserve"> Página de termo de assinatura anexada ao PDF assinado com certificado, com a relação dos signatários (CPF mascarado, autoridade certificadora e data e hora) e QR Code que leva à página pública de verificação do documento.</w:t>
+      </w:r>
+    </w:p>
+    <w:p>
+      <w:pPr>
         <w:pStyle w:val="Heading3"/>
         <w:keepNext/>
         <w:spacing w:after="120" w:before="240"/>
@@ -2121,6 +2347,48 @@
     </w:p>
     <w:p>
       <w:pPr>
+        <w:spacing w:after="120" w:line="276"/>
+        <w:jc w:val="both"/>
+      </w:pPr>
+      <w:r>
+        <w:rPr>
+          <w:b/>
+          <w:bCs/>
+        </w:rPr>
+        <w:t xml:space="preserve">RF-114.</w:t>
+      </w:r>
+      <w:r>
+        <w:t xml:space="preserve"> Assinatura </w:t>
+      </w:r>
+      <w:r>
+        <w:rPr>
+          <w:b/>
+          <w:bCs/>
+        </w:rPr>
+        <w:t xml:space="preserve">em ordem</w:t>
+      </w:r>
+      <w:r>
+        <w:t xml:space="preserve">, opcional por solicitação: cada signatário só pode assinar depois que todos os de ordem anterior assinaram, a pendência só lhe é apresentada quando chega a sua vez, e ele é notificado nesse momento.</w:t>
+      </w:r>
+    </w:p>
+    <w:p>
+      <w:pPr>
+        <w:spacing w:after="120" w:line="276"/>
+        <w:jc w:val="both"/>
+      </w:pPr>
+      <w:r>
+        <w:rPr>
+          <w:b/>
+          <w:bCs/>
+        </w:rPr>
+        <w:t xml:space="preserve">RF-115.</w:t>
+      </w:r>
+      <w:r>
+        <w:t xml:space="preserve"> Recusa de assinatura pelo signatário, com motivo obrigatório, notificação ao solicitante, registro em auditoria e encerramento da solicitação, que deixa de aceitar as demais assinaturas e não é considerada concluída.</w:t>
+      </w:r>
+    </w:p>
+    <w:p>
+      <w:pPr>
         <w:pStyle w:val="Heading3"/>
         <w:keepNext/>
         <w:spacing w:after="120" w:before="240"/>
@@ -2168,7 +2436,7 @@
         <w:t xml:space="preserve">manifesto de assinaturas</w:t>
       </w:r>
       <w:r>
-        <w:t xml:space="preserve"> em PDF, por solicitação, com os dados do documento, a relação dos signatários, a modalidade de cada assinatura, as evidências previstas no requisito RF-120 e a base legal aplicável.</w:t>
+        <w:t xml:space="preserve"> em PDF, por solicitação, com os dados do documento, a relação dos signatários, a modalidade de cada assinatura, as evidências previstas no requisito RF-120 e a base legal aplicável, disponível somente aos participantes da solicitação e a quem tem acesso ao documento.</w:t>
       </w:r>
     </w:p>
     <w:p>
@@ -2288,7 +2556,7 @@
         <w:t xml:space="preserve">formulário dinâmico de abertura</w:t>
       </w:r>
       <w:r>
-        <w:t xml:space="preserve">, com campos de texto, número, valor monetário, data, texto longo e lista de opções, rótulo e ordem configuráveis, cujos dados ficam registrados no processo.</w:t>
+        <w:t xml:space="preserve">, com campos de texto, número, valor monetário, data, texto longo e lista de opções, rótulo, ordem e obrigatoriedade configuráveis, recusada a abertura quando faltar campo obrigatório ou o valor não corresponder ao tipo do campo, e com os dados registrados no processo.</w:t>
       </w:r>
     </w:p>
     <w:p>
@@ -2363,6 +2631,22 @@
       </w:r>
       <w:r>
         <w:t xml:space="preserve"> Consulta de processos por número ou assunto, situação, tipo e prioridade, com paginação dos resultados.</w:t>
+      </w:r>
+    </w:p>
+    <w:p>
+      <w:pPr>
+        <w:spacing w:after="120" w:line="276"/>
+        <w:jc w:val="both"/>
+      </w:pPr>
+      <w:r>
+        <w:rPr>
+          <w:b/>
+          <w:bCs/>
+        </w:rPr>
+        <w:t xml:space="preserve">RF-157.</w:t>
+      </w:r>
+      <w:r>
+        <w:t xml:space="preserve"> Juntada de arquivos digitais na abertura e nos despachos, com registro de nome, tamanho, autor e resumo criptográfico, e download dos arquivos juntados por quem tem acesso ao processo.</w:t>
       </w:r>
     </w:p>
     <w:p>
@@ -2499,6 +2783,70 @@
     </w:p>
     <w:p>
       <w:pPr>
+        <w:spacing w:after="120" w:line="276"/>
+        <w:jc w:val="both"/>
+      </w:pPr>
+      <w:r>
+        <w:rPr>
+          <w:b/>
+          <w:bCs/>
+        </w:rPr>
+        <w:t xml:space="preserve">RF-177.</w:t>
+      </w:r>
+      <w:r>
+        <w:t xml:space="preserve"> Registro formal do recebimento do processo pela unidade ou pelo servidor de destino, com data, hora e recebedor; o despacho de etapa ainda não recebida registra o recebimento por quem despacha.</w:t>
+      </w:r>
+    </w:p>
+    <w:p>
+      <w:pPr>
+        <w:spacing w:after="120" w:line="276"/>
+        <w:jc w:val="both"/>
+      </w:pPr>
+      <w:r>
+        <w:rPr>
+          <w:b/>
+          <w:bCs/>
+        </w:rPr>
+        <w:t xml:space="preserve">RF-178.</w:t>
+      </w:r>
+      <w:r>
+        <w:t xml:space="preserve"> Devolução do processo ao remetente anterior, com justificativa, e cancelamento do processo, com motivo.</w:t>
+      </w:r>
+    </w:p>
+    <w:p>
+      <w:pPr>
+        <w:spacing w:after="120" w:line="276"/>
+        <w:jc w:val="both"/>
+      </w:pPr>
+      <w:r>
+        <w:rPr>
+          <w:b/>
+          <w:bCs/>
+        </w:rPr>
+        <w:t xml:space="preserve">RF-179.</w:t>
+      </w:r>
+      <w:r>
+        <w:t xml:space="preserve"> Execução de recebimento, despacho, devolução, juntada, decisão, arquivamento e cancelamento somente pelo destinatário da etapa ativa — servidor indicado, servidor da unidade de destino ou usuário com acesso geral à unidade gestora — ou, antes do primeiro despacho, pelo autor, com verificação no servidor.</w:t>
+      </w:r>
+    </w:p>
+    <w:p>
+      <w:pPr>
+        <w:spacing w:after="120" w:line="276"/>
+        <w:jc w:val="both"/>
+      </w:pPr>
+      <w:r>
+        <w:rPr>
+          <w:b/>
+          <w:bCs/>
+        </w:rPr>
+        <w:t xml:space="preserve">RF-180.</w:t>
+      </w:r>
+      <w:r>
+        <w:t xml:space="preserve"> Comentários no processo, com indicação de comentário interno, relacionados à etapa em curso e consultáveis no próprio processo.</w:t>
+      </w:r>
+    </w:p>
+    <w:p>
+      <w:pPr>
         <w:pStyle w:val="Heading2"/>
         <w:keepNext/>
         <w:spacing w:after="120" w:before="240"/>
@@ -2741,6 +3089,38 @@
     </w:p>
     <w:p>
       <w:pPr>
+        <w:spacing w:after="120" w:line="276"/>
+        <w:jc w:val="both"/>
+      </w:pPr>
+      <w:r>
+        <w:rPr>
+          <w:b/>
+          <w:bCs/>
+        </w:rPr>
+        <w:t xml:space="preserve">RF-216.</w:t>
+      </w:r>
+      <w:r>
+        <w:t xml:space="preserve"> Download dos anexos de memorandos, ofícios e circulares por quem tem acesso à comunicação.</w:t>
+      </w:r>
+    </w:p>
+    <w:p>
+      <w:pPr>
+        <w:spacing w:after="120" w:line="276"/>
+        <w:jc w:val="both"/>
+      </w:pPr>
+      <w:r>
+        <w:rPr>
+          <w:b/>
+          <w:bCs/>
+        </w:rPr>
+        <w:t xml:space="preserve">RF-217.</w:t>
+      </w:r>
+      <w:r>
+        <w:t xml:space="preserve"> Verificação pública da autenticidade de memorando, ofício e circular por QR Code impresso no documento em PDF, com número, remetente, unidade, órgão, data de emissão e situação, omitido o assunto de comunicação confidencial.</w:t>
+      </w:r>
+    </w:p>
+    <w:p>
+      <w:pPr>
         <w:pStyle w:val="Heading2"/>
         <w:keepNext/>
         <w:spacing w:after="120" w:before="240"/>
@@ -2783,6 +3163,22 @@
     </w:p>
     <w:p>
       <w:pPr>
+        <w:spacing w:after="120" w:line="276"/>
+        <w:jc w:val="both"/>
+      </w:pPr>
+      <w:r>
+        <w:rPr>
+          <w:b/>
+          <w:bCs/>
+        </w:rPr>
+        <w:t xml:space="preserve">RF-232.</w:t>
+      </w:r>
+      <w:r>
+        <w:t xml:space="preserve"> Tela de notificações do usuário, com filtro das não lidas, marcação individual ou geral como lida e acesso direto ao documento, processo ou comunicação a que a notificação se refere.</w:t>
+      </w:r>
+    </w:p>
+    <w:p>
+      <w:pPr>
         <w:pStyle w:val="Heading2"/>
         <w:keepNext/>
         <w:spacing w:after="120" w:before="240"/>
@@ -3120,7 +3516,7 @@
         <w:t xml:space="preserve">QR Code</w:t>
       </w:r>
       <w:r>
-        <w:t xml:space="preserve">, sem autenticação, com exibição do tipo, do autor, da situação, da versão vigente e do resumo criptográfico do arquivo.</w:t>
+        <w:t xml:space="preserve">, sem autenticação, com exibição do tipo, do autor, da situação, da versão vigente, do resumo criptográfico do arquivo e das assinaturas concluídas, preservado o sigilo: de documento confidencial ou restrito, exibem-se apenas a autenticidade, o resumo criptográfico e a modalidade e a data das assinaturas.</w:t>
       </w:r>
     </w:p>
     <w:p>
@@ -3156,7 +3552,7 @@
         <w:t xml:space="preserve">RF-400.</w:t>
       </w:r>
       <w:r>
-        <w:t xml:space="preserve"> Cadastro dos sistemas externos autorizados a integrar-se à solução, com emissão de credencial exclusiva na forma do requisito RS-008, regeneração com invalidação da credencial anterior, ativação e desativação, e bloqueio da exclusão de sistema que tenha enviado documentos.</w:t>
+        <w:t xml:space="preserve"> Cadastro dos sistemas externos autorizados a integrar-se à solução, com emissão de credencial exclusiva na forma do requisito RS-012, regeneração com invalidação da credencial anterior, ativação e desativação, e bloqueio da exclusão de sistema que tenha enviado documentos.</w:t>
       </w:r>
     </w:p>
     <w:p>
@@ -3214,7 +3610,7 @@
         <w:t xml:space="preserve">RF-405.</w:t>
       </w:r>
       <w:r>
-        <w:t xml:space="preserve"> Recebimento, pela interface de integração, de documento PDF com tipo documental, unidade gestora, número de origem, nome, descrição, metadados, pasta de destino, endereço de retorno e relação de signatários identificados por CPF, com posição visual da assinatura no documento, criando-se o documento, a versão e a solicitação de assinatura em uma única transação.</w:t>
+        <w:t xml:space="preserve"> Recebimento, pela interface de integração, de documento PDF com tipo documental, unidade gestora, número de origem, nome, descrição, metadados, pasta de destino, endereço de retorno e relação de signatários identificados por CPF, com posição visual da assinatura no documento e indicação opcional de assinatura em ordem, criando-se o documento, a versão e a solicitação de assinatura em uma única transação. O reenvio de número de origem já recebido e não cancelado devolve o documento existente, sem duplicá-lo.</w:t>
       </w:r>
     </w:p>
     <w:p>
@@ -4786,7 +5182,25 @@
         <w:jc w:val="both"/>
       </w:pPr>
       <w:r>
-        <w:t xml:space="preserve">h) verificação pública de autenticidade de documento por QR Code.</w:t>
+        <w:t xml:space="preserve">h) verificação pública de autenticidade de documento por QR Code;</w:t>
+      </w:r>
+    </w:p>
+    <w:p>
+      <w:pPr>
+        <w:spacing w:after="120" w:line="276"/>
+        <w:jc w:val="both"/>
+      </w:pPr>
+      <w:r>
+        <w:t xml:space="preserve">i) acesso por usuário sem perfil administrativo às rotinas de administração, com recusa, e consulta de documento restrito por usuário que não é autor nem signatário, sem que o documento apareça em listagens ou pesquisas;</w:t>
+      </w:r>
+    </w:p>
+    <w:p>
+      <w:pPr>
+        <w:spacing w:after="120" w:line="276"/>
+        <w:jc w:val="both"/>
+      </w:pPr>
+      <w:r>
+        <w:t xml:space="preserve">j) envio de nova versão de documento, consulta da trilha de auditoria na ficha e restauração de versão anterior.</w:t>
       </w:r>
     </w:p>
     <w:p>

</xml_diff>